<commit_message>
Update policymaking lecture slides
</commit_message>
<xml_diff>
--- a/study-guides/Exam 1/POLSC343-Exam1-Answer-Key.docx
+++ b/study-guides/Exam 1/POLSC343-Exam1-Answer-Key.docx
@@ -74,12 +74,12 @@
           <w:sz w:val="22"/>
           <w:szCs w:val="22"/>
         </w:rPr>
-        <w:t xml:space="preserve">1a   2b   3b   4b   5b   6a   7b   8b   9b   10b   11b   12b   13b   14b   15b   16b   17b</w:t>
-      </w:r>
-    </w:p>
-    <w:p>
-      <w:pPr>
-        <w:spacing w:after="160" w:before="0" w:line="360" w:lineRule="auto"/>
+        <w:t xml:space="preserve">1d   2c   3a   4b   5d   6a   7c   8b   9d   10a   11c   12d   13a   14b   15c   16b   17a</w:t>
+      </w:r>
+    </w:p>
+    <w:p>
+      <w:pPr>
+        <w:spacing w:after="120" w:before="0" w:line="360" w:lineRule="auto"/>
       </w:pPr>
       <w:r>
         <w:rPr>
@@ -90,7 +90,23 @@
           <w:sz w:val="22"/>
           <w:szCs w:val="22"/>
         </w:rPr>
-        <w:t xml:space="preserve">18T   19F   20T</w:t>
+        <w:t xml:space="preserve">18T   19F   20F</w:t>
+      </w:r>
+    </w:p>
+    <w:p>
+      <w:pPr>
+        <w:spacing w:after="160" w:before="0" w:line="360" w:lineRule="auto"/>
+      </w:pPr>
+      <w:r>
+        <w:rPr>
+          <w:b w:val="false"/>
+          <w:bCs w:val="false"/>
+          <w:i/>
+          <w:iCs/>
+          <w:sz w:val="22"/>
+          <w:szCs w:val="22"/>
+        </w:rPr>
+        <w:t xml:space="preserve">Answer positions: 5 a, 4 b, 4 c, 4 d across the 17 multiple choice items, with no two consecutive questions sharing the same correct letter. True/false runs T, F, F.</w:t>
       </w:r>
     </w:p>
     <w:p>
@@ -155,7 +171,7 @@
           <w:sz w:val="22"/>
           <w:szCs w:val="22"/>
         </w:rPr>
-        <w:t xml:space="preserve">1.   a. An economic doctrine holding that military power and economic influence complement each other, with policies favoring the mother country over its colonies and competitors.</w:t>
+        <w:t xml:space="preserve">1.   d. An economic doctrine holding that military power and economic influence complement each other, with policies favoring the mother country over its colonies and competitors.</w:t>
       </w:r>
       <w:r>
         <w:rPr>
@@ -180,7 +196,7 @@
           <w:sz w:val="21"/>
           <w:szCs w:val="21"/>
         </w:rPr>
-        <w:t xml:space="preserve">Straight from the glossary (Frieden, Lake and Schultz). (b) is the Smith/Kant position mercantilism opposes; (c) is autarky; (d) describes early US revenue policy, not the doctrine.</w:t>
+        <w:t xml:space="preserve">Straight from the glossary (Frieden, Lake and Schultz). (a) is the Smith and Kant position mercantilism opposes; (b) is autarky; (c) describes early US revenue practice rather than the doctrine.</w:t>
       </w:r>
     </w:p>
     <w:p>
@@ -197,7 +213,7 @@
           <w:sz w:val="22"/>
           <w:szCs w:val="22"/>
         </w:rPr>
-        <w:t xml:space="preserve">2.   b. 1803, for $15 million, financed by Napoleon’s need for revenue for his European wars.</w:t>
+        <w:t xml:space="preserve">2.   c. Its list of grievances includes foreign policy grievances—restrictions on colonial trade, the quartering of troops, and the use of foreign mercenaries—and its universal language about rights becomes a standard later generations hold the US to, at home and abroad.</w:t>
       </w:r>
       <w:r>
         <w:rPr>
@@ -206,7 +222,7 @@
           <w:sz w:val="19"/>
           <w:szCs w:val="19"/>
         </w:rPr>
-        <w:t xml:space="preserve">   [recall]</w:t>
+        <w:t xml:space="preserve">   [analytic]</w:t>
       </w:r>
     </w:p>
     <w:p>
@@ -222,7 +238,7 @@
           <w:sz w:val="21"/>
           <w:szCs w:val="21"/>
         </w:rPr>
-        <w:t xml:space="preserve">1803, $15 million. Two related facts worth crediting if a student volunteers them: the Haitian revolt had already wrecked French ambitions in North America, and Livingston exceeded his instructions in making the deal.</w:t>
+        <w:t xml:space="preserve">Two halves. The grievance list is substantially about trade, troops and mercenaries; and the universal rights language becomes the standard later invoked against American practice at home.</w:t>
       </w:r>
     </w:p>
     <w:p>
@@ -239,7 +255,7 @@
           <w:sz w:val="22"/>
           <w:szCs w:val="22"/>
         </w:rPr>
-        <w:t xml:space="preserve">3.   b. Its list of grievances includes foreign policy grievances—restrictions on colonial trade, the quartering of troops, and the use of foreign mercenaries—and its universal language about rights becomes a standard later generations hold the US to, at home and abroad.</w:t>
+        <w:t xml:space="preserve">3.   a. It argues that a permanent standing army concentrated in federal hands endangers liberty—a warning worth contrasting with the permanent establishment the US actually built after 1945.</w:t>
       </w:r>
       <w:r>
         <w:rPr>
@@ -264,7 +280,7 @@
           <w:sz w:val="21"/>
           <w:szCs w:val="21"/>
         </w:rPr>
-        <w:t xml:space="preserve">Two halves. The grievance list is substantially about trade, troops and mercenaries; and the universal rights language becomes the standard invoked by the National Negro Congress petition in 1946 and by Dudziak’s actors in the 1950s.</w:t>
+        <w:t xml:space="preserve">(b) inverts the document—Brutus is Anti-Federalist. The pairing carries an argument: founding-era wariness of standing armies establishes that the post-1945 establishment is a rupture, not an American tradition.</w:t>
       </w:r>
     </w:p>
     <w:p>
@@ -281,7 +297,7 @@
           <w:sz w:val="22"/>
           <w:szCs w:val="22"/>
         </w:rPr>
-        <w:t xml:space="preserve">4.   b. It argues that a permanent standing army concentrated in federal hands endangers liberty—a warning worth reading against the permanent establishment the US actually built after 1945.</w:t>
+        <w:t xml:space="preserve">4.   b. 1803, for $15 million, driven by Napoleon’s need to finance his European wars.</w:t>
       </w:r>
       <w:r>
         <w:rPr>
@@ -290,7 +306,7 @@
           <w:sz w:val="19"/>
           <w:szCs w:val="19"/>
         </w:rPr>
-        <w:t xml:space="preserve">   [analytic]</w:t>
+        <w:t xml:space="preserve">   [recall]</w:t>
       </w:r>
     </w:p>
     <w:p>
@@ -306,7 +322,7 @@
           <w:sz w:val="21"/>
           <w:szCs w:val="21"/>
         </w:rPr>
-        <w:t xml:space="preserve">(d) inverts the document—Brutus is Anti-Federalist. The pairing carries an argument: founding-era wariness of standing armies establishes that the post-1945 establishment is a rupture, not an American tradition.</w:t>
+        <w:t xml:space="preserve">1803, $15 million. Two related facts worth crediting if a student volunteers them: the Haitian revolt had already wrecked French ambitions in North America, and Livingston exceeded his instructions in making the deal.</w:t>
       </w:r>
     </w:p>
     <w:p>
@@ -323,7 +339,7 @@
           <w:sz w:val="22"/>
           <w:szCs w:val="22"/>
         </w:rPr>
-        <w:t xml:space="preserve">5.   b. America should be the well-wisher of freedom everywhere but the champion and vindicator only of her own, and that involvement in foreign wars would change the fundamental maxims of American policy.</w:t>
+        <w:t xml:space="preserve">5.   d. America should be the well-wisher of freedom everywhere but the champion and vindicator only of her own, and involvement in foreign wars would change the fundamental principles of American policy.</w:t>
       </w:r>
       <w:r>
         <w:rPr>
@@ -348,7 +364,7 @@
           <w:sz w:val="21"/>
           <w:szCs w:val="21"/>
         </w:rPr>
-        <w:t xml:space="preserve">The warning about altered maxims does the analytic work—it is a claim about what intervention does to the intervening state, not merely about cost or risk. Puts Adams in the same column as Brutus X and the Farewell Address.</w:t>
+        <w:t xml:space="preserve">The warning about altered principles does the analytic work—it is a claim about what intervention does to the intervening state, not merely about cost or risk. Puts Adams in the same column as Brutus X and the Farewell Address.</w:t>
       </w:r>
     </w:p>
     <w:p>
@@ -365,7 +381,7 @@
           <w:sz w:val="22"/>
           <w:szCs w:val="22"/>
         </w:rPr>
-        <w:t xml:space="preserve">6.   a. It coincided with the closing of the frontier and therefore framed the immediate question of whether overseas colonies could serve the function the frontier had.</w:t>
+        <w:t xml:space="preserve">6.   a. The US lacked the naval capacity to enforce it and depended substantially on the British navy for roughly a century.</w:t>
       </w:r>
       <w:r>
         <w:rPr>
@@ -390,7 +406,7 @@
           <w:sz w:val="21"/>
           <w:szCs w:val="21"/>
         </w:rPr>
-        <w:t xml:space="preserve">The thesis arrives as the frontier is declared closed, and the expansion debate follows immediately—live questions in the 1890s, not retrospective ones. (d) is the 1870s.</w:t>
+        <w:t xml:space="preserve">A declaration the declaring state could not enforce; British sea power did the work. (c) is built from a true clause—the Doctrine did pledge not to interfere with existing colonies—that is not the enforcement problem.</w:t>
       </w:r>
     </w:p>
     <w:p>
@@ -407,7 +423,7 @@
           <w:sz w:val="22"/>
           <w:szCs w:val="22"/>
         </w:rPr>
-        <w:t xml:space="preserve">7.   b. The Philippines, Guam, and Puerto Rico, along with a qualified position in Cuba; Hawaii was annexed separately the same year.</w:t>
+        <w:t xml:space="preserve">7.   c. The tariff was the federal government’s revenue source, and while higher tariffs meant more revenue they had different effects on different regions, depending on their economic makeup and reliance on imports.</w:t>
       </w:r>
       <w:r>
         <w:rPr>
@@ -416,7 +432,7 @@
           <w:sz w:val="19"/>
           <w:szCs w:val="19"/>
         </w:rPr>
-        <w:t xml:space="preserve">   [recall]</w:t>
+        <w:t xml:space="preserve">   [analytic]</w:t>
       </w:r>
     </w:p>
     <w:p>
@@ -432,7 +448,7 @@
           <w:sz w:val="21"/>
           <w:szCs w:val="21"/>
         </w:rPr>
-        <w:t xml:space="preserve">Hawaii was annexed in July 1898 on its own strategic logic—Pacific position and fear that a rising Japan would take it—not as a spoil of the war. Cuba is the qualified case (Guantanamo Bay).</w:t>
+        <w:t xml:space="preserve">There would be no income tax for another century, so the tariff was the revenue instrument—and its burden fell unevenly by region, depending on economic makeup and reliance on imports. That is why the revenue-versus-protection line was never clean in practice, why South Carolina’s grievance was plausible to those who held it, and why tariff politics becomes the through-line of the course.</w:t>
       </w:r>
     </w:p>
     <w:p>
@@ -449,7 +465,7 @@
           <w:sz w:val="22"/>
           <w:szCs w:val="22"/>
         </w:rPr>
-        <w:t xml:space="preserve">8.   b. Removal of economic barriers, self-determination, and a general association of nations—which reappear as the Bretton Woods system, the handling of colonial territories, and the UN.</w:t>
+        <w:t xml:space="preserve">8.   b. It coincided with the closing of the frontier and therefore framed the immediate question of whether overseas colonies could serve the function the frontier had.</w:t>
       </w:r>
       <w:r>
         <w:rPr>
@@ -474,7 +490,7 @@
           <w:sz w:val="21"/>
           <w:szCs w:val="21"/>
         </w:rPr>
-        <w:t xml:space="preserve">The blueprint fails in 1919 and largely succeeds, altered, after 1945—the contrast the unit is built around. (c) is wrong because the naval conferences lapse rather than institutionalize anything.</w:t>
+        <w:t xml:space="preserve">The thesis arrives as the frontier is declared closed, and the expansion debate follows immediately—live questions in the 1890s, not retrospective ones. (c) is the 1870s.</w:t>
       </w:r>
     </w:p>
     <w:p>
@@ -491,7 +507,7 @@
           <w:sz w:val="22"/>
           <w:szCs w:val="22"/>
         </w:rPr>
-        <w:t xml:space="preserve">9.   b. Ending the Pacific war quickly was also a means of limiting Soviet involvement in the Pacific and in the postwar settlement.</w:t>
+        <w:t xml:space="preserve">9.   d. The Philippines, Guam, and Puerto Rico, along with a qualified position in Cuba; Hawaii was annexed separately the same year.</w:t>
       </w:r>
       <w:r>
         <w:rPr>
@@ -500,7 +516,7 @@
           <w:sz w:val="19"/>
           <w:szCs w:val="19"/>
         </w:rPr>
-        <w:t xml:space="preserve">   [analytic]</w:t>
+        <w:t xml:space="preserve">   [recall]</w:t>
       </w:r>
     </w:p>
     <w:p>
@@ -516,7 +532,7 @@
           <w:sz w:val="21"/>
           <w:szCs w:val="21"/>
         </w:rPr>
-        <w:t xml:space="preserve">(a) is false—Truman learned of the project only on taking office, April 12, 1945. (c) inverts the scarcity argument. (d) inverts Stimson, who opposed a demonstration and removed Kyoto from the target list.</w:t>
+        <w:t xml:space="preserve">Hawaii was annexed in July 1898 on its own strategic logic—Pacific position and fear that a rising Japan would take it—not as a spoil of the war. Cuba is the qualified case (Guantanamo Bay).</w:t>
       </w:r>
     </w:p>
     <w:p>
@@ -533,7 +549,7 @@
           <w:sz w:val="22"/>
           <w:szCs w:val="22"/>
         </w:rPr>
-        <w:t xml:space="preserve">10.   b. George Kennan wrote the Long Telegram and the X Article; Paul Nitze was principal author of NSC-68.</w:t>
+        <w:t xml:space="preserve">10.   a. Removal of economic barriers, self-determination, and a general association of nations—which reappear as the Bretton Woods system, the handling of colonial territories, and the UN.</w:t>
       </w:r>
       <w:r>
         <w:rPr>
@@ -542,7 +558,7 @@
           <w:sz w:val="19"/>
           <w:szCs w:val="19"/>
         </w:rPr>
-        <w:t xml:space="preserve">   [recall]</w:t>
+        <w:t xml:space="preserve">   [analytic]</w:t>
       </w:r>
     </w:p>
     <w:p>
@@ -558,7 +574,7 @@
           <w:sz w:val="21"/>
           <w:szCs w:val="21"/>
         </w:rPr>
-        <w:t xml:space="preserve">Kennan: Long Telegram (1946) and “The Sources of Soviet Conduct” (Foreign Affairs, 1947). Nitze: NSC-68 (1950). (a) is the trap—the names reversed.</w:t>
+        <w:t xml:space="preserve">The blueprint fails in 1919 and largely succeeds, altered, after 1945—the contrast the unit is built around. (b) is wrong because the naval conferences lapse rather than institutionalize anything.</w:t>
       </w:r>
     </w:p>
     <w:p>
@@ -575,7 +591,7 @@
           <w:sz w:val="22"/>
           <w:szCs w:val="22"/>
         </w:rPr>
-        <w:t xml:space="preserve">11.   b. The X Article prescribed long-term, patient but firm and vigilant containment applied largely through non-military counter-pressure; NSC-68 called for a large, sustained military buildup—implying a different kind of American state.</w:t>
+        <w:t xml:space="preserve">11.   c. Ending the Pacific war quickly was also a means of limiting Soviet involvement in the Pacific and in the postwar settlement.</w:t>
       </w:r>
       <w:r>
         <w:rPr>
@@ -600,7 +616,7 @@
           <w:sz w:val="21"/>
           <w:szCs w:val="21"/>
         </w:rPr>
-        <w:t xml:space="preserve">Containment was never one policy: same diagnosis of Soviet conduct, different means, and a different state required to carry it out. The stem names the documents rather than their authors so it does not give away Q10.</w:t>
+        <w:t xml:space="preserve">(a) is false—Truman learned of the project only on taking office, April 12, 1945. (b) inverts the scarcity argument. (d) inverts Stimson, who opposed a demonstration and removed Kyoto from the target list.</w:t>
       </w:r>
     </w:p>
     <w:p>
@@ -617,7 +633,7 @@
           <w:sz w:val="22"/>
           <w:szCs w:val="22"/>
         </w:rPr>
-        <w:t xml:space="preserve">12.   b. Discouraging another actor from taking an action by making the negative consequences of that action clear—which requires that the threat be credible.</w:t>
+        <w:t xml:space="preserve">12.   d. George Kennan wrote the Long Telegram and the X Article; Paul Nitze was principal author of NSC-68.</w:t>
       </w:r>
       <w:r>
         <w:rPr>
@@ -642,7 +658,7 @@
           <w:sz w:val="21"/>
           <w:szCs w:val="21"/>
         </w:rPr>
-        <w:t xml:space="preserve">Discouraging, not reversing—(a) is compellence. (c) is burden sharing and (d) is the security dilemma, both also on the glossary. Credibility is the part that must appear for full credit.</w:t>
+        <w:t xml:space="preserve">Kennan: the Long Telegram (1946) and “The Sources of Soviet Conduct” (Foreign Affairs, 1947). Nitze: NSC-68 (1950). (a) is the trap, with the two names reversed.</w:t>
       </w:r>
     </w:p>
     <w:p>
@@ -659,7 +675,7 @@
           <w:sz w:val="22"/>
           <w:szCs w:val="22"/>
         </w:rPr>
-        <w:t xml:space="preserve">13.   b. Unilateral action would provoke backlash and erode the buy-in and legitimacy on which a rules-based order depends, so binding itself was a condition of the order’s durability.</w:t>
+        <w:t xml:space="preserve">13.   a. Discouraging another actor from taking an action by making the negative consequences of that action clear—which requires that the threat be credible.</w:t>
       </w:r>
       <w:r>
         <w:rPr>
@@ -668,7 +684,7 @@
           <w:sz w:val="19"/>
           <w:szCs w:val="19"/>
         </w:rPr>
-        <w:t xml:space="preserve">   [analytic]</w:t>
+        <w:t xml:space="preserve">   [recall]</w:t>
       </w:r>
     </w:p>
     <w:p>
@@ -684,7 +700,7 @@
           <w:sz w:val="21"/>
           <w:szCs w:val="21"/>
         </w:rPr>
-        <w:t xml:space="preserve">Note the related qualification from lecture: hegemony is a preponderance of power, not the ability to get everything you want—(d) confuses the two. (c) inverts the NATO story, in which the US insisted the Europeans ask.</w:t>
+        <w:t xml:space="preserve">Discouraging, not reversing—(b) is compellence. (c) is burden sharing and (d) is the security dilemma, both also on the glossary. Credibility is the element that must appear for full credit.</w:t>
       </w:r>
     </w:p>
     <w:p>
@@ -701,7 +717,7 @@
           <w:sz w:val="22"/>
           <w:szCs w:val="22"/>
         </w:rPr>
-        <w:t xml:space="preserve">14.   b. That the communist world was deeply divided from the start, yet US policymakers routinely described it as a single bloc and underestimated those divisions even when contrary evidence was available.</w:t>
+        <w:t xml:space="preserve">14.   b. That foreign aid sits structurally between humanitarian purpose and strategic instrument, and American goals and interests were often misaligned with local goals and interests.</w:t>
       </w:r>
       <w:r>
         <w:rPr>
@@ -726,7 +742,7 @@
           <w:sz w:val="21"/>
           <w:szCs w:val="21"/>
         </w:rPr>
-        <w:t xml:space="preserve">Acheson on Tito—“he might be a son of a bitch, but he’s our son of a bitch”—shows the split was recognized and exploited in that one case, which makes the general misreading harder to excuse rather than easier. (d) overstates: the US aided Tito without revising the monolith premise.</w:t>
+        <w:t xml:space="preserve">Structural, not a phase the agency passed through—which is what makes (a) the attractive wrong answer. The ideals-versus-interests theme in institutional form, with the added point that American aims and recipients’ aims frequently diverged. Basis of the Week 4 discussion question.</w:t>
       </w:r>
     </w:p>
     <w:p>
@@ -743,7 +759,7 @@
           <w:sz w:val="22"/>
           <w:szCs w:val="22"/>
         </w:rPr>
-        <w:t xml:space="preserve">15.   b. That foreign aid sits structurally between humanitarian purpose and strategic instrument, and that the tension is built into the enterprise rather than incidental to it.</w:t>
+        <w:t xml:space="preserve">15.   c. Party positions were not fixed: Republicans were the fiscally wary party in the early Cold War, and their positions shifted as defense dollars and Republican electoral strength both migrated to the South and West.</w:t>
       </w:r>
       <w:r>
         <w:rPr>
@@ -768,7 +784,7 @@
           <w:sz w:val="21"/>
           <w:szCs w:val="21"/>
         </w:rPr>
-        <w:t xml:space="preserve">Structural, not a phase the agency passed through—which is what makes (a) the attractive wrong answer. The ideals-versus-interests theme in institutional form, and the basis of the Week 4 discussion question.</w:t>
+        <w:t xml:space="preserve">Finding plus mechanism—and the mechanism is geographic and economic, which is why the stickiness of bases sited in the 1940s matters so much to the argument.</w:t>
       </w:r>
     </w:p>
     <w:p>
@@ -785,7 +801,7 @@
           <w:sz w:val="22"/>
           <w:szCs w:val="22"/>
         </w:rPr>
-        <w:t xml:space="preserve">16.   b. Party positions were not fixed: Republicans were the fiscally wary party in the early Cold War, and their positions shifted as defense dollars and Republican electoral strength both migrated to the South and West.</w:t>
+        <w:t xml:space="preserve">16.   b. Defense spending is spread across a very large number of congressional districts, while military personnel are far more geographically concentrated.</w:t>
       </w:r>
       <w:r>
         <w:rPr>
@@ -810,7 +826,7 @@
           <w:sz w:val="21"/>
           <w:szCs w:val="21"/>
         </w:rPr>
-        <w:t xml:space="preserve">Finding plus mechanism—and the mechanism is geographic and economic, which is why the stickiness of bases sited in the 1940s matters so much to the argument.</w:t>
+        <w:t xml:space="preserve">The asymmetry is the political point. Because spending reaches so many districts, any proposed cut mobilizes a large number of members whose constituents have a direct economic stake—which converts a foreign policy question into a distributive politics question.</w:t>
       </w:r>
     </w:p>
     <w:p>
@@ -827,7 +843,7 @@
           <w:sz w:val="22"/>
           <w:szCs w:val="22"/>
         </w:rPr>
-        <w:t xml:space="preserve">17.   b. American segregation was a propaganda liability abroad, giving federal policymakers an international incentive to support desegregation that was independent of domestic moral or electoral pressure.</w:t>
+        <w:t xml:space="preserve">17.   a. American segregation was a propaganda liability abroad, giving federal policymakers an international incentive to support desegregation that was independent of domestic moral or electoral pressure.</w:t>
       </w:r>
       <w:r>
         <w:rPr>
@@ -852,7 +868,7 @@
           <w:sz w:val="21"/>
           <w:szCs w:val="21"/>
         </w:rPr>
-        <w:t xml:space="preserve">The Justice Department’s amicus filings are the evidence to cite. (d) describes a real dynamic of the period—red-baiting of rights claims—but it is not Dudziak’s thesis.</w:t>
+        <w:t xml:space="preserve">The Justice Department’s amicus filings are the evidence to cite. (c) describes a real dynamic of the period—the red-baiting of rights claims—but it is not Dudziak’s thesis.</w:t>
       </w:r>
     </w:p>
     <w:p>
@@ -957,7 +973,7 @@
           <w:sz w:val="22"/>
           <w:szCs w:val="22"/>
         </w:rPr>
-        <w:t xml:space="preserve">20.   TRUE</w:t>
+        <w:t xml:space="preserve">20.   FALSE</w:t>
       </w:r>
       <w:r>
         <w:rPr>
@@ -980,7 +996,7 @@
           <w:sz w:val="21"/>
           <w:szCs w:val="21"/>
         </w:rPr>
-        <w:t xml:space="preserve">True, and the fear was well founded: the National Negro Congress brought a petition on June 6, 1946. Byrnes, Secretary of State 1945–1947 and a staunch segregationist, is the emblematic figure.</w:t>
+        <w:t xml:space="preserve">False. Recovery was underway before the war, and the cuts to federal spending between 1936 and 1938—roughly 20 percent in nominal terms—stalled it and pushed the country back into recession. The study guide flags this belief as both inaccurate and dangerous, the danger being the implication that war is a growth strategy.</w:t>
       </w:r>
     </w:p>
     <w:p>
@@ -1009,7 +1025,7 @@
           <w:sz w:val="22"/>
           <w:szCs w:val="22"/>
         </w:rPr>
-        <w:t xml:space="preserve">20 points each. Suggested allocation: 14 points for the required elements below, 6 for precision and organization. These are one-paragraph answers—grade for whether the student can state the distinction cleanly, not for how much they can fit on the page. An answer that recites correct facts without explaining how they connect caps at 10.</w:t>
+        <w:t xml:space="preserve">20 points each. Suggested allocation: 14 points for the required elements below, 6 for precision and organization. These are one-paragraph answers—grade for whether the student can state the point cleanly, not for how much they can fit on the page. An answer that recites correct facts without explaining how they connect caps at 10.</w:t>
       </w:r>
     </w:p>
     <w:p>
@@ -1031,7 +1047,7 @@
           <w:sz w:val="22"/>
           <w:szCs w:val="22"/>
         </w:rPr>
-        <w:t xml:space="preserve">Washington’s Farewell Address is routinely cited as a call for isolationism. Explain why that reading is imprecise, and state what the Address actually recommends.</w:t>
+        <w:t xml:space="preserve">Washington’s Farewell Address is routinely cited as a call for isolationism. Explain why that reading is imprecise, and state what the Address actually recommends. How does this compare to the course of American foreign policy over the 19th and 20th centuries?</w:t>
       </w:r>
     </w:p>
     <w:p>
@@ -1111,7 +1127,7 @@
           <w:sz w:val="22"/>
           <w:szCs w:val="22"/>
         </w:rPr>
-        <w:t xml:space="preserve">Credit: connecting Adams’s 1821 address or Brutus X as earlier statements of the same distinction; or noting the early republic pursued trade aggressively while avoiding alliances.</w:t>
+        <w:t xml:space="preserve">Credit: connecting Adams’s 1821 address or Brutus X as earlier statements of the same distinction; or noting that the early republic pursued trade aggressively while avoiding alliances.</w:t>
       </w:r>
     </w:p>
     <w:p>
@@ -1131,29 +1147,7 @@
           <w:sz w:val="22"/>
           <w:szCs w:val="22"/>
         </w:rPr>
-        <w:t xml:space="preserve">At 125–175 words, expect the two required elements plus one of the others. Do not penalize the absence of the interwar material.</w:t>
-      </w:r>
-    </w:p>
-    <w:p>
-      <w:pPr>
-        <w:pStyle w:val="Heading2"/>
-      </w:pPr>
-      <w:r>
-        <w:t xml:space="preserve">Question 2</w:t>
-      </w:r>
-    </w:p>
-    <w:p>
-      <w:pPr>
-        <w:spacing w:after="120" w:line="360" w:lineRule="auto"/>
-      </w:pPr>
-      <w:r>
-        <w:rPr>
-          <w:i/>
-          <w:iCs/>
-          <w:sz w:val="22"/>
-          <w:szCs w:val="22"/>
-        </w:rPr>
-        <w:t xml:space="preserve">American foreign policy is often explained as a response to threats and events abroad. Across this unit, however, domestic politics repeatedly shaped foreign policy outcomes. Using two examples from different periods, explain how a domestic interest, coalition, or institution shaped a specific foreign policy outcome. What do your examples suggest about the relationship between domestic politics and foreign policy over time?</w:t>
+        <w:t xml:space="preserve">Required by the second half of the prompt—a comparison to what the US actually did across the nineteenth and twentieth centuries. Accept either direction: that practice largely tracked the Address through the nineteenth century (aggressive trade, no alliances until the twentieth), or that the post-1945 turn to permanent alliances and standing forces abroad broke with it, with the Address still invoked by opponents of commitment.</w:t>
       </w:r>
     </w:p>
     <w:p>
@@ -1173,7 +1167,29 @@
           <w:sz w:val="22"/>
           <w:szCs w:val="22"/>
         </w:rPr>
-        <w:t xml:space="preserve">Required—two examples from different periods, each tied to a specific outcome with the domestic mechanism named. Strong candidates: tariff politics and the Nullification Crisis (regional economic interests, 1828–1833); slavery and the annexation of Texas; the monitor-versus-blue-water fight over ship design in the 1890s; Lodge, the Senate Foreign Relations Committee, and the rejection of Versailles; the Neutrality Acts; FDR siting bases in the South; divided government after 1946, Vandenberg, and the Republican fingerprints on the Marshall Plan and NATO; the wartime reversal of Republican trade positions (Hiscox); the migration of defense spending and Republican strength to the South and West (Fordham); Byrnes, the UN petition procedures, and Brown (Dudziak).</w:t>
+        <w:t xml:space="preserve">At 125–175 words, expect the two required elements, the comparison, and at most one of the others. Do not penalize the absence of the interwar material.</w:t>
+      </w:r>
+    </w:p>
+    <w:p>
+      <w:pPr>
+        <w:pStyle w:val="Heading2"/>
+      </w:pPr>
+      <w:r>
+        <w:t xml:space="preserve">Question 2</w:t>
+      </w:r>
+    </w:p>
+    <w:p>
+      <w:pPr>
+        <w:spacing w:after="120" w:line="360" w:lineRule="auto"/>
+      </w:pPr>
+      <w:r>
+        <w:rPr>
+          <w:i/>
+          <w:iCs/>
+          <w:sz w:val="22"/>
+          <w:szCs w:val="22"/>
+        </w:rPr>
+        <w:t xml:space="preserve">American foreign policy is often explained as a response to threats and events abroad. Across this unit, however, domestic politics repeatedly shaped foreign policy outcomes. Using two examples from different periods, explain how a domestic interest, coalition, or institution shaped a specific foreign policy outcome. What do your examples suggest about the relationship between domestic politics and foreign policy over time?</w:t>
       </w:r>
     </w:p>
     <w:p>
@@ -1193,7 +1209,7 @@
           <w:sz w:val="22"/>
           <w:szCs w:val="22"/>
         </w:rPr>
-        <w:t xml:space="preserve">Required—the mechanism, not just the coincidence. A student who says “Congress opposed the League” has named an event; one who explains that opposition hinged on Article X and sovereignty, and that Lodge controlled the committee that set the agenda, has named a mechanism.</w:t>
+        <w:t xml:space="preserve">Required—two examples from different periods, each tied to a specific outcome with the domestic mechanism named. Strong candidates: tariff politics and the Nullification Crisis (regional economic interests, 1828–1833); slavery and the annexation of Texas; the monitor-versus-blue-water fight over ship design in the 1890s; Lodge, the Senate Foreign Relations Committee, and the rejection of Versailles; the Neutrality Acts; FDR siting bases in the South; divided government after 1946, Vandenberg, and the Republican fingerprints on the Marshall Plan and NATO; the wartime reversal of Republican trade positions (Hiscox); the migration of defense spending and Republican strength to the South and West (Fordham); the international incentive to support desegregation (Dudziak).</w:t>
       </w:r>
     </w:p>
     <w:p>
@@ -1213,7 +1229,7 @@
           <w:sz w:val="22"/>
           <w:szCs w:val="22"/>
         </w:rPr>
-        <w:t xml:space="preserve">Required—the generalization the prompt asks for. The strongest answers identify a pattern: coalitions follow economic position and geography, so party positions on trade and military spending change as their bases change. Credit equally a student who argues institutions (committee chairs, divided government) matter as much as interests.</w:t>
+        <w:t xml:space="preserve">Required—the mechanism, not just the coincidence. A student who says “Congress opposed the League” has named an event; one who explains that opposition hinged on Article X and sovereignty, and that Lodge controlled the committee that set the agenda, has named a mechanism.</w:t>
       </w:r>
     </w:p>
     <w:p>
@@ -1233,7 +1249,7 @@
           <w:sz w:val="22"/>
           <w:szCs w:val="22"/>
         </w:rPr>
-        <w:t xml:space="preserve">Credit, do not require: that the international arena also reshapes domestic politics in return (Dudziak; the NNC petition); or that the pattern calls the exogenous-threat account of the Cold War consensus into question.</w:t>
+        <w:t xml:space="preserve">Required—the generalization the prompt asks for. The strongest answers identify a pattern: coalitions follow economic position and geography, so party positions on trade and military spending change as their bases change. Credit equally a student who argues that institutions—committee chairs, divided government—matter as much as interests.</w:t>
       </w:r>
     </w:p>
     <w:p>
@@ -1253,7 +1269,27 @@
           <w:sz w:val="22"/>
           <w:szCs w:val="22"/>
         </w:rPr>
-        <w:t xml:space="preserve">At 125–175 words, expect two compact examples and a one- or two-sentence conclusion. Examples from the same period (for example, two Cold War cases) earn at most 14.</w:t>
+        <w:t xml:space="preserve">Credit, do not require: that the international arena also reshapes domestic politics in return (Dudziak); or that the pattern calls the exogenous-threat account of the Cold War consensus into question.</w:t>
+      </w:r>
+    </w:p>
+    <w:p>
+      <w:pPr>
+        <w:spacing w:after="100" w:line="360" w:lineRule="auto"/>
+        <w:ind w:left="400" w:hanging="240"/>
+      </w:pPr>
+      <w:r>
+        <w:rPr>
+          <w:sz w:val="22"/>
+          <w:szCs w:val="22"/>
+        </w:rPr>
+        <w:t xml:space="preserve">•   </w:t>
+      </w:r>
+      <w:r>
+        <w:rPr>
+          <w:sz w:val="22"/>
+          <w:szCs w:val="22"/>
+        </w:rPr>
+        <w:t xml:space="preserve">At 125–175 words, expect two compact examples and a one- or two-sentence conclusion. Examples drawn from the same period (two Cold War cases, say) earn at most 14.</w:t>
       </w:r>
     </w:p>
     <w:p>
@@ -1290,7 +1326,7 @@
           <w:sz w:val="22"/>
           <w:szCs w:val="22"/>
         </w:rPr>
-        <w:t xml:space="preserve">7 of 20 objective items, 35 percent: Q1 (mercantilism), Q2 (Louisiana Purchase), Q7 (1898 acquisitions), Q10 (Kennan and Nitze), Q12 (deterrence), TF 18 (Manifest Destiny), TF 19 (Truman Doctrine and the Marshall address).</w:t>
+        <w:t xml:space="preserve">7 of 20 objective items, 35 percent: Q1 (mercantilism), Q4 (Louisiana Purchase), Q9 (1898 acquisitions), Q12 (Kennan and Nitze), Q13 (deterrence), TF 18 (Manifest Destiny), TF 19 (Truman Doctrine and the Marshall address).</w:t>
       </w:r>
     </w:p>
     <w:p>
@@ -1306,7 +1342,7 @@
           <w:sz w:val="22"/>
           <w:szCs w:val="22"/>
         </w:rPr>
-        <w:t xml:space="preserve">These are drawn from the “definitions to know cold” table, the timeline, and the people list, so a student who worked the review sheet should clear all seven quickly. They exist to set the floor and to buy time for Part II.</w:t>
+        <w:t xml:space="preserve">These come from the “definitions to know cold” table, the timeline, and the people list, so a student who worked the review sheet should clear all seven quickly. They set the floor and buy time for Part II.</w:t>
       </w:r>
     </w:p>
     <w:p>
@@ -1330,7 +1366,7 @@
           <w:sz w:val="22"/>
           <w:szCs w:val="22"/>
         </w:rPr>
-        <w:t xml:space="preserve">Early Years, 1783–1870: Q1–Q5; TF 18; SA1.</w:t>
+        <w:t xml:space="preserve">Early Years, 1783–1870: Q1–Q7; TF 18; SA1. Seven of the twenty objective items, the heaviest block on the exam.</w:t>
       </w:r>
     </w:p>
     <w:p>
@@ -1346,7 +1382,7 @@
           <w:sz w:val="22"/>
           <w:szCs w:val="22"/>
         </w:rPr>
-        <w:t xml:space="preserve">Transitional Period, 1870–1945: Q6–Q8.</w:t>
+        <w:t xml:space="preserve">Transitional Period, 1870–1945: Q8–Q10; TF 20.</w:t>
       </w:r>
     </w:p>
     <w:p>
@@ -1362,7 +1398,7 @@
           <w:sz w:val="22"/>
           <w:szCs w:val="22"/>
         </w:rPr>
-        <w:t xml:space="preserve">From world war to Cold War, and hegemony: Q9–Q15; TF 19.</w:t>
+        <w:t xml:space="preserve">From world war to Cold War: Q11–Q14; TF 19.</w:t>
       </w:r>
     </w:p>
     <w:p>
@@ -1378,7 +1414,15 @@
           <w:sz w:val="22"/>
           <w:szCs w:val="22"/>
         </w:rPr>
-        <w:t xml:space="preserve">The Cold War and domestic politics: Q16, Q17; TF 20.</w:t>
+        <w:t xml:space="preserve">The Cold War and domestic politics: Q15–Q17; SA2. Three objective items plus half of Part II.</w:t>
+      </w:r>
+    </w:p>
+    <w:p>
+      <w:pPr>
+        <w:pStyle w:val="Heading2"/>
+      </w:pPr>
+      <w:r>
+        <w:t xml:space="preserve">By assigned reading</w:t>
       </w:r>
     </w:p>
     <w:p>
@@ -1394,7 +1438,23 @@
           <w:sz w:val="22"/>
           <w:szCs w:val="22"/>
         </w:rPr>
-        <w:t xml:space="preserve">Domestic politics across the whole unit: SA2, which lets students draw on any period.</w:t>
+        <w:t xml:space="preserve">Declaration of Independence—Q2. Brutus X—Q3. J.Q. Adams, 1821—Q5. Turner—Q8. Fourteen Points—Q10. Kennan and NSC-68—Q12. Schelling on credibility—Q13. Norris—Q14. Fordham—Q15. Dudziak—Q17. Washington’s Farewell Address—SA1. Hiscox—available to SA2.</w:t>
+      </w:r>
+    </w:p>
+    <w:p>
+      <w:pPr>
+        <w:spacing w:after="50" w:before="0" w:line="360" w:lineRule="auto"/>
+      </w:pPr>
+      <w:r>
+        <w:rPr>
+          <w:b w:val="false"/>
+          <w:bCs w:val="false"/>
+          <w:i/>
+          <w:iCs/>
+          <w:sz w:val="22"/>
+          <w:szCs w:val="22"/>
+        </w:rPr>
+        <w:t xml:space="preserve">Q15, Q16 and Q17 hand students three usable SA2 examples. That is deliberate: SA2 grades the explanation of mechanism and the generalization, not recall of the case. A student who only restates Q15 without the mechanism will not score well.</w:t>
       </w:r>
     </w:p>
     <w:p>
@@ -1402,12 +1462,12 @@
         <w:pStyle w:val="Heading2"/>
       </w:pPr>
       <w:r>
-        <w:t xml:space="preserve">By assigned reading</w:t>
-      </w:r>
-    </w:p>
-    <w:p>
-      <w:pPr>
-        <w:spacing w:after="50" w:before="0" w:line="360" w:lineRule="auto"/>
+        <w:t xml:space="preserve">Pitfalls deliberately baited</w:t>
+      </w:r>
+    </w:p>
+    <w:p>
+      <w:pPr>
+        <w:spacing w:after="40" w:before="0" w:line="360" w:lineRule="auto"/>
       </w:pPr>
       <w:r>
         <w:rPr>
@@ -1418,31 +1478,7 @@
           <w:sz w:val="22"/>
           <w:szCs w:val="22"/>
         </w:rPr>
-        <w:t xml:space="preserve">Declaration of Independence—Q3. Brutus X—Q4. J.Q. Adams, 1821—Q5. Turner—Q6. Fourteen Points—Q8. Kennan, “Sources of Soviet Conduct”—Q10, Q11. NSC-68—Q10, Q11. Schelling on credibility—Q12. Ikenberry—Q13. Norris—Q15. Fordham—Q16, and available to SA2. Dudziak—Q17, and available to SA2. Truman Doctrine—TF 19. Washington’s Farewell Address—SA1. Hiscox—available to SA2.</w:t>
-      </w:r>
-    </w:p>
-    <w:p>
-      <w:pPr>
-        <w:spacing w:after="50" w:before="0" w:line="360" w:lineRule="auto"/>
-      </w:pPr>
-      <w:r>
-        <w:rPr>
-          <w:b w:val="false"/>
-          <w:bCs w:val="false"/>
-          <w:i/>
-          <w:iCs/>
-          <w:sz w:val="22"/>
-          <w:szCs w:val="22"/>
-        </w:rPr>
-        <w:t xml:space="preserve">Q16 and Q17 hand students two usable SA2 examples. That is deliberate: SA2 grades the explanation of mechanism and the generalization, not the recall of the case. A student who only restates Q16 without the mechanism will not score well.</w:t>
-      </w:r>
-    </w:p>
-    <w:p>
-      <w:pPr>
-        <w:pStyle w:val="Heading2"/>
-      </w:pPr>
-      <w:r>
-        <w:t xml:space="preserve">Pitfalls deliberately baited</w:t>
+        <w:t xml:space="preserve">“Isolationism” as a period description—Q5, SA1.</w:t>
       </w:r>
     </w:p>
     <w:p>
@@ -1458,7 +1494,7 @@
           <w:sz w:val="22"/>
           <w:szCs w:val="22"/>
         </w:rPr>
-        <w:t xml:space="preserve">“Isolationism” as a period description—Q5, SA1.</w:t>
+        <w:t xml:space="preserve">Standing armies and permanent alliances as American tradition—Q3.</w:t>
       </w:r>
     </w:p>
     <w:p>
@@ -1474,7 +1510,7 @@
           <w:sz w:val="22"/>
           <w:szCs w:val="22"/>
         </w:rPr>
-        <w:t xml:space="preserve">Containment as a single policy—Q10, Q11.</w:t>
+        <w:t xml:space="preserve">Slavery and civil rights as interruptions of the foreign policy story—Q2, Q17, SA2.</w:t>
       </w:r>
     </w:p>
     <w:p>
@@ -1490,7 +1526,7 @@
           <w:sz w:val="22"/>
           <w:szCs w:val="22"/>
         </w:rPr>
-        <w:t xml:space="preserve">Standing armies as American tradition—Q4.</w:t>
+        <w:t xml:space="preserve">The claim that World War II ended the Great Depression—TF 20.</w:t>
       </w:r>
     </w:p>
     <w:p>
@@ -1506,7 +1542,7 @@
           <w:sz w:val="22"/>
           <w:szCs w:val="22"/>
         </w:rPr>
-        <w:t xml:space="preserve">Hegemony as the ability to get what you want—Q13.</w:t>
+        <w:t xml:space="preserve">Fixed party ideology—Q15, SA2.</w:t>
       </w:r>
     </w:p>
     <w:p>
@@ -1522,7 +1558,7 @@
           <w:sz w:val="22"/>
           <w:szCs w:val="22"/>
         </w:rPr>
-        <w:t xml:space="preserve">The monolithic communist bloc—Q14.</w:t>
+        <w:t xml:space="preserve">Conflating the Truman Doctrine with the Marshall Plan—TF 19.</w:t>
       </w:r>
     </w:p>
     <w:p>
@@ -1538,7 +1574,7 @@
           <w:sz w:val="22"/>
           <w:szCs w:val="22"/>
         </w:rPr>
-        <w:t xml:space="preserve">Fixed party ideology—Q16, SA2.</w:t>
+        <w:t xml:space="preserve">Treating tariff policy as regionally neutral, or the revenue and protective purposes as cleanly separable—Q7.</w:t>
       </w:r>
     </w:p>
     <w:p>
@@ -1549,28 +1585,12 @@
         <w:rPr>
           <w:b w:val="false"/>
           <w:bCs w:val="false"/>
-          <w:i w:val="false"/>
-          <w:iCs w:val="false"/>
-          <w:sz w:val="22"/>
-          <w:szCs w:val="22"/>
-        </w:rPr>
-        <w:t xml:space="preserve">Slavery and civil rights as interruptions of the foreign policy story—Q3, Q17, TF 20, SA2.</w:t>
-      </w:r>
-    </w:p>
-    <w:p>
-      <w:pPr>
-        <w:spacing w:after="40" w:before="0" w:line="360" w:lineRule="auto"/>
-      </w:pPr>
-      <w:r>
-        <w:rPr>
-          <w:b w:val="false"/>
-          <w:bCs w:val="false"/>
-          <w:i w:val="false"/>
-          <w:iCs w:val="false"/>
-          <w:sz w:val="22"/>
-          <w:szCs w:val="22"/>
-        </w:rPr>
-        <w:t xml:space="preserve">Conflating the Truman Doctrine with the Marshall Plan—TF 19.</w:t>
+          <w:i/>
+          <w:iCs/>
+          <w:sz w:val="22"/>
+          <w:szCs w:val="22"/>
+        </w:rPr>
+        <w:t xml:space="preserve">Not baited on this version: containment as a single policy. Q12 tests only who wrote what. If you want the Kennan-versus-Nitze distinction tested, it belongs in Part II rather than in a multiple choice item.</w:t>
       </w:r>
     </w:p>
     <w:sectPr>

</xml_diff>